<commit_message>
3.1-§ yakunlandi: 13 ko'rsatkichli yagona metodika bo'yicha qayta yig'ildi
Co-Authored-By: Claude Opus 5.5 <noreply@anthropic.com>
Claude-Session: https://claude.ai/code/session_01PxHTC8Q7yHdrpAeUA5KUgM
</commit_message>
<xml_diff>
--- a/paragraflar/3.1-paragraf.docx
+++ b/paragraflar/3.1-paragraf.docx
@@ -2,7 +2,7 @@
 <file path=word/document.xml><?xml version="1.0" encoding="utf-8"?>
 <w:document xmlns:w="http://schemas.openxmlformats.org/wordprocessingml/2006/main" xmlns:m="http://schemas.openxmlformats.org/officeDocument/2006/math" xmlns:r="http://schemas.openxmlformats.org/officeDocument/2006/relationships" xmlns:o="urn:schemas-microsoft-com:office:office" xmlns:v="urn:schemas-microsoft-com:vml" xmlns:w10="urn:schemas-microsoft-com:office:word" xmlns:a="http://schemas.openxmlformats.org/drawingml/2006/main" xmlns:pic="http://schemas.openxmlformats.org/drawingml/2006/picture" xmlns:wp="http://schemas.openxmlformats.org/drawingml/2006/wordprocessingDrawing">
   <w:body>
-    <w:bookmarkStart w:id="57" w:name="X1b5accc681c3101e34ae1424a5e2c752f5d3c99"/>
+    <w:bookmarkStart w:id="58" w:name="X1b5accc681c3101e34ae1424a5e2c752f5d3c99"/>
     <w:p>
       <w:pPr>
         <w:pStyle w:val="Heading2"/>
@@ -446,7 +446,7 @@
                 <w:rFonts w:ascii="Times New Roman" w:hAnsi="Times New Roman" w:cs="Times New Roman" w:eastAsia="Times New Roman"/>
                 <w:sz w:val="22"/>
               </w:rPr>
-              <w:t xml:space="preserve">Likvidlik me’yorlari Bazel III dan soddalashtirilgan</w:t>
+              <w:t xml:space="preserve">Likvidlik me’yorlari Bazel III dan soddalashtirilgan va ochiq e’lon qilinmaydi</w:t>
             </w:r>
           </w:p>
         </w:tc>
@@ -486,7 +486,7 @@
                 <w:rFonts w:ascii="Times New Roman" w:hAnsi="Times New Roman" w:cs="Times New Roman" w:eastAsia="Times New Roman"/>
                 <w:sz w:val="22"/>
               </w:rPr>
-              <w:t xml:space="preserve">Likvidlik bloki Bazel III metodikasi bo‘yicha hisoblanadi</w:t>
+              <w:t xml:space="preserve">Likvidlik bloki barcha banklar uchun hisoblanadigan XVJ ko‘rsatkichlari bo‘yicha baholanadi, LCR va NSFR Bazel III bo‘yicha tekshiruv uchun qayta hisoblanadi</w:t>
             </w:r>
           </w:p>
         </w:tc>
@@ -934,7 +934,7 @@
                                   <w:sz w:val="20"/>
                                   <w:szCs w:val="20"/>
                                 </w:rPr>
-                                <w:t xml:space="preserve">3. 14 ta ko‘rsatkichni</w:t>
+                                <w:t xml:space="preserve">3. 13 ta ko‘rsatkichni</w:t>
                               </w:r>
                             </w:p>
                             <w:p>
@@ -1573,7 +1573,7 @@
           <w:rFonts w:ascii="Times New Roman" w:hAnsi="Times New Roman" w:cs="Times New Roman" w:eastAsia="Times New Roman"/>
           <w:sz w:val="28"/>
         </w:rPr>
-        <w:t xml:space="preserve">. To‘rtinchisi – iqtisodiy talqin qilinishi: ko‘rsatkich qiymatining o‘sishi barqarorlikni oshirishi yoki pasaytirishi aniq bo‘lishi kerak. Ushbu mezonlar asosida 1.2-paragrafda asoslangan besh blok bo‘yicha 14 ta ko‘rsatkich tanlandi (3.1.2-jadval).</w:t>
+        <w:t xml:space="preserve">. To‘rtinchisi – iqtisodiy talqin qilinishi: ko‘rsatkich qiymatining o‘sishi barqarorlikni oshirishi yoki pasaytirishi aniq bo‘lishi kerak. Ushbu mezonlar asosida 1.2-paragrafda asoslangan besh blok bo‘yicha 13 ta ko‘rsatkich tanlandi (3.1.2-jadval).</w:t>
       </w:r>
     </w:p>
     <w:p>
@@ -2148,7 +2148,7 @@
                 <w:rFonts w:ascii="Times New Roman" w:hAnsi="Times New Roman" w:cs="Times New Roman" w:eastAsia="Times New Roman"/>
                 <w:sz w:val="22"/>
               </w:rPr>
-              <w:t xml:space="preserve">K3. Leverage, %</w:t>
+              <w:t xml:space="preserve">K3. Kapital / aktivlar, %</w:t>
             </w:r>
           </w:p>
         </w:tc>
@@ -2168,7 +2168,7 @@
                 <w:rFonts w:ascii="Times New Roman" w:hAnsi="Times New Roman" w:cs="Times New Roman" w:eastAsia="Times New Roman"/>
                 <w:sz w:val="22"/>
               </w:rPr>
-              <w:t xml:space="preserve">Bazel III, XVJ</w:t>
+              <w:t xml:space="preserve">XVJ, Bazel III</w:t>
             </w:r>
           </w:p>
         </w:tc>
@@ -2844,7 +2844,7 @@
                 <w:rFonts w:ascii="Times New Roman" w:hAnsi="Times New Roman" w:cs="Times New Roman" w:eastAsia="Times New Roman"/>
                 <w:sz w:val="22"/>
               </w:rPr>
-              <w:t xml:space="preserve">L1. Likvidlikni qoplash koeffitsiyenti, %</w:t>
+              <w:t xml:space="preserve">L1. Yuqori likvid aktivlar / jami aktivlar, %</w:t>
             </w:r>
           </w:p>
         </w:tc>
@@ -2864,7 +2864,7 @@
                 <w:rFonts w:ascii="Times New Roman" w:hAnsi="Times New Roman" w:cs="Times New Roman" w:eastAsia="Times New Roman"/>
                 <w:sz w:val="22"/>
               </w:rPr>
-              <w:t xml:space="preserve">Bazel III, XVJ</w:t>
+              <w:t xml:space="preserve">XVJ</w:t>
             </w:r>
           </w:p>
         </w:tc>
@@ -2884,7 +2884,7 @@
                 <w:rFonts w:ascii="Times New Roman" w:hAnsi="Times New Roman" w:cs="Times New Roman" w:eastAsia="Times New Roman"/>
                 <w:sz w:val="22"/>
               </w:rPr>
-              <w:t xml:space="preserve">≤ 90</w:t>
+              <w:t xml:space="preserve">≤ 5</w:t>
             </w:r>
           </w:p>
         </w:tc>
@@ -2904,7 +2904,7 @@
                 <w:rFonts w:ascii="Times New Roman" w:hAnsi="Times New Roman" w:cs="Times New Roman" w:eastAsia="Times New Roman"/>
                 <w:sz w:val="22"/>
               </w:rPr>
-              <w:t xml:space="preserve">100</w:t>
+              <w:t xml:space="preserve">10</w:t>
             </w:r>
           </w:p>
         </w:tc>
@@ -2924,7 +2924,7 @@
                 <w:rFonts w:ascii="Times New Roman" w:hAnsi="Times New Roman" w:cs="Times New Roman" w:eastAsia="Times New Roman"/>
                 <w:sz w:val="22"/>
               </w:rPr>
-              <w:t xml:space="preserve">120</w:t>
+              <w:t xml:space="preserve">15</w:t>
             </w:r>
           </w:p>
         </w:tc>
@@ -2944,7 +2944,7 @@
                 <w:rFonts w:ascii="Times New Roman" w:hAnsi="Times New Roman" w:cs="Times New Roman" w:eastAsia="Times New Roman"/>
                 <w:sz w:val="22"/>
               </w:rPr>
-              <w:t xml:space="preserve">≥ 150</w:t>
+              <w:t xml:space="preserve">≥ 20</w:t>
             </w:r>
           </w:p>
         </w:tc>
@@ -2969,132 +2969,7 @@
                 <w:rFonts w:ascii="Times New Roman" w:hAnsi="Times New Roman" w:cs="Times New Roman" w:eastAsia="Times New Roman"/>
                 <w:sz w:val="22"/>
               </w:rPr>
-              <w:t xml:space="preserve">L2. Sof barqaror moliyalashtirish me’yori, %</w:t>
-            </w:r>
-          </w:p>
-        </w:tc>
-        <w:tc>
-          <w:tcPr>
-            <w:tcW w:type="dxa" w:w="1361"/>
-          </w:tcPr>
-          <w:p>
-            <w:pPr>
-              <w:pStyle w:val="Compact"/>
-              <w:spacing w:line="240" w:lineRule="auto"/>
-              <w:ind w:firstLine="0"/>
-              <w:jc w:val="center"/>
-            </w:pPr>
-            <w:r>
-              <w:rPr>
-                <w:rFonts w:ascii="Times New Roman" w:hAnsi="Times New Roman" w:cs="Times New Roman" w:eastAsia="Times New Roman"/>
-                <w:sz w:val="22"/>
-              </w:rPr>
-              <w:t xml:space="preserve">Bazel III, XVJ</w:t>
-            </w:r>
-          </w:p>
-        </w:tc>
-        <w:tc>
-          <w:tcPr>
-            <w:tcW w:type="dxa" w:w="1106"/>
-          </w:tcPr>
-          <w:p>
-            <w:pPr>
-              <w:pStyle w:val="Compact"/>
-              <w:spacing w:line="240" w:lineRule="auto"/>
-              <w:ind w:firstLine="0"/>
-              <w:jc w:val="center"/>
-            </w:pPr>
-            <w:r>
-              <w:rPr>
-                <w:rFonts w:ascii="Times New Roman" w:hAnsi="Times New Roman" w:cs="Times New Roman" w:eastAsia="Times New Roman"/>
-                <w:sz w:val="22"/>
-              </w:rPr>
-              <w:t xml:space="preserve">≤ 90</w:t>
-            </w:r>
-          </w:p>
-        </w:tc>
-        <w:tc>
-          <w:tcPr>
-            <w:tcW w:type="dxa" w:w="1106"/>
-          </w:tcPr>
-          <w:p>
-            <w:pPr>
-              <w:pStyle w:val="Compact"/>
-              <w:spacing w:line="240" w:lineRule="auto"/>
-              <w:ind w:firstLine="0"/>
-              <w:jc w:val="center"/>
-            </w:pPr>
-            <w:r>
-              <w:rPr>
-                <w:rFonts w:ascii="Times New Roman" w:hAnsi="Times New Roman" w:cs="Times New Roman" w:eastAsia="Times New Roman"/>
-                <w:sz w:val="22"/>
-              </w:rPr>
-              <w:t xml:space="preserve">100</w:t>
-            </w:r>
-          </w:p>
-        </w:tc>
-        <w:tc>
-          <w:tcPr>
-            <w:tcW w:type="dxa" w:w="1106"/>
-          </w:tcPr>
-          <w:p>
-            <w:pPr>
-              <w:pStyle w:val="Compact"/>
-              <w:spacing w:line="240" w:lineRule="auto"/>
-              <w:ind w:firstLine="0"/>
-              <w:jc w:val="center"/>
-            </w:pPr>
-            <w:r>
-              <w:rPr>
-                <w:rFonts w:ascii="Times New Roman" w:hAnsi="Times New Roman" w:cs="Times New Roman" w:eastAsia="Times New Roman"/>
-                <w:sz w:val="22"/>
-              </w:rPr>
-              <w:t xml:space="preserve">110</w:t>
-            </w:r>
-          </w:p>
-        </w:tc>
-        <w:tc>
-          <w:tcPr>
-            <w:tcW w:type="dxa" w:w="1106"/>
-          </w:tcPr>
-          <w:p>
-            <w:pPr>
-              <w:pStyle w:val="Compact"/>
-              <w:spacing w:line="240" w:lineRule="auto"/>
-              <w:ind w:firstLine="0"/>
-              <w:jc w:val="center"/>
-            </w:pPr>
-            <w:r>
-              <w:rPr>
-                <w:rFonts w:ascii="Times New Roman" w:hAnsi="Times New Roman" w:cs="Times New Roman" w:eastAsia="Times New Roman"/>
-                <w:sz w:val="22"/>
-              </w:rPr>
-              <w:t xml:space="preserve">≥ 120</w:t>
-            </w:r>
-          </w:p>
-        </w:tc>
-      </w:tr>
-      <w:tr>
-        <w:trPr>
-          <w:cantSplit/>
-        </w:trPr>
-        <w:tc>
-          <w:tcPr>
-            <w:tcW w:type="dxa" w:w="3515"/>
-          </w:tcPr>
-          <w:p>
-            <w:pPr>
-              <w:pStyle w:val="Compact"/>
-              <w:spacing w:line="240" w:lineRule="auto"/>
-              <w:ind w:firstLine="0"/>
-              <w:jc w:val="left"/>
-            </w:pPr>
-            <w:r>
-              <w:rPr>
-                <w:rFonts w:ascii="Times New Roman" w:hAnsi="Times New Roman" w:cs="Times New Roman" w:eastAsia="Times New Roman"/>
-                <w:sz w:val="22"/>
-              </w:rPr>
-              <w:t xml:space="preserve">L3. Kreditlar / mijozlar depozitlari, %</w:t>
+              <w:t xml:space="preserve">L2. Kreditlar / mijozlar depozitlari, %</w:t>
             </w:r>
           </w:p>
         </w:tc>
@@ -4102,7 +3977,7 @@
           <w:rFonts w:ascii="Times New Roman" w:hAnsi="Times New Roman" w:cs="Times New Roman" w:eastAsia="Times New Roman"/>
           <w:sz w:val="28"/>
         </w:rPr>
-        <w:t xml:space="preserve">. Regulyativ kapital uchun ham xuddi shu mantiq qo‘llandi: 8 foiz – Bazel III minimumi, 10,5 foiz – bufer bilan, 13 foiz – milliy talab, 15,5 foiz – milliy talab va bufer. Leverage uchun chegaralar Bazel III dagi 3 foiz, AQSh nazorat amaliyotidagi 4 foiz</w:t>
+        <w:t xml:space="preserve">. Regulyativ kapital uchun ham xuddi shu mantiq qo‘llandi: 8 foiz – Bazel III minimumi, 10,5 foiz – bufer bilan, 13 foiz – milliy talab, 15,5 foiz – milliy talab va bufer. Kapitalning aktivlarga nisbati Xalqaro valyuta jamg‘armasining asosiy ko‘rsatkichlaridan biri bo‘lib, Bazel III dagi leverage koeffitsiyentiga yaqin mazmunga ega, uning chegaralari Bazel III dagi 3 foiz, AQSh nazorat amaliyotidagi 4 foiz</w:t>
       </w:r>
       <w:r>
         <w:rPr>
@@ -4122,7 +3997,7 @@
           <w:rFonts w:ascii="Times New Roman" w:hAnsi="Times New Roman" w:cs="Times New Roman" w:eastAsia="Times New Roman"/>
           <w:sz w:val="28"/>
         </w:rPr>
-        <w:t xml:space="preserve">va milliy talabdagi 6 foiz asosida belgilandi.</w:t>
+        <w:t xml:space="preserve">va milliy leverage talabidagi 6 foiz asosida belgilandi.</w:t>
       </w:r>
     </w:p>
     <w:p>
@@ -4176,7 +4051,7 @@
           <w:rFonts w:ascii="Times New Roman" w:hAnsi="Times New Roman" w:cs="Times New Roman" w:eastAsia="Times New Roman"/>
           <w:sz w:val="28"/>
         </w:rPr>
-        <w:t xml:space="preserve">. Likvidlik blokida likvidlikni qoplash koeffitsiyenti va sof barqaror moliyalashtirish me’yori uchun 2 ball chegarasi sifatida Bazel III dagi 100 foizlik talab olindi</w:t>
+        <w:t xml:space="preserve">. Likvidlik blokiga likvidlikni qoplash koeffitsiyenti va sof barqaror moliyalashtirish me’yori kiritilmadi, chunki banklar ularni ochiq e’lon qilmaydi va ularni hisoblash uchun Markaziy bankka taqdim etiladigan batafsil shakllar talab etiladi</w:t>
       </w:r>
       <w:r>
         <w:rPr>
@@ -4195,7 +4070,7 @@
           <w:rFonts w:ascii="Times New Roman" w:hAnsi="Times New Roman" w:cs="Times New Roman" w:eastAsia="Times New Roman"/>
           <w:sz w:val="28"/>
         </w:rPr>
-        <w:t xml:space="preserve">, kreditlarning depozitlarga nisbati uchun esa likvidlik nizomida muammo belgisi deb ko‘rsatilgan 80 foiz</w:t>
+        <w:t xml:space="preserve">. Agar indeksga faqat ayrim banklar uchun hisoblanadigan ko‘rsatkichlar kiritilsa, banklarni yagona metodika bo‘yicha solishtirish imkoniyati yo‘qoladi. Shu sababli bu ikki me’yor 2.3-paragrafda ko‘rsatilganidek Bazel III metodikasi bo‘yicha alohida qayta hisoblanib, indeks natijalarini tekshirish uchun qo‘llanadi. Likvidlik blokida esa Xalqaro valyuta jamg‘armasining asosiy ko‘rsatkichi – yuqori likvid aktivlarning jami aktivlardagi ulushi olindi, uning 2 ball chegarasi sifatida Markaziy bank tomonidan belgilangan 10 foizlik minimal talab qabul qilindi</w:t>
       </w:r>
       <w:r>
         <w:rPr>
@@ -4208,6 +4083,19 @@
           <w:rFonts w:ascii="Times New Roman" w:hAnsi="Times New Roman" w:cs="Times New Roman" w:eastAsia="Times New Roman"/>
           <w:sz w:val="28"/>
         </w:rPr>
+        <w:t xml:space="preserve">. Kreditlarning depozitlarga nisbati uchun esa likvidlik nizomida muammo belgisi deb ko‘rsatilgan 80 foiz</w:t>
+      </w:r>
+      <w:r>
+        <w:rPr>
+          <w:rStyle w:val="FootnoteReference"/>
+        </w:rPr>
+        <w:footnoteReference w:id="40"/>
+      </w:r>
+      <w:r>
+        <w:rPr>
+          <w:rFonts w:ascii="Times New Roman" w:hAnsi="Times New Roman" w:cs="Times New Roman" w:eastAsia="Times New Roman"/>
+          <w:sz w:val="28"/>
+        </w:rPr>
         <w:t xml:space="preserve"> </w:t>
       </w:r>
       <w:r>
@@ -4221,7 +4109,7 @@
         <w:rPr>
           <w:rStyle w:val="FootnoteReference"/>
         </w:rPr>
-        <w:footnoteReference w:id="40"/>
+        <w:footnoteReference w:id="41"/>
       </w:r>
       <w:r>
         <w:rPr>
@@ -4241,7 +4129,7 @@
         <w:rPr>
           <w:rStyle w:val="FootnoteReference"/>
         </w:rPr>
-        <w:footnoteReference w:id="41"/>
+        <w:footnoteReference w:id="42"/>
       </w:r>
       <w:r>
         <w:rPr>
@@ -4254,7 +4142,7 @@
         <w:rPr>
           <w:rStyle w:val="FootnoteReference"/>
         </w:rPr>
-        <w:footnoteReference w:id="42"/>
+        <w:footnoteReference w:id="43"/>
       </w:r>
       <w:r>
         <w:rPr>
@@ -4267,7 +4155,7 @@
         <w:rPr>
           <w:rStyle w:val="FootnoteReference"/>
         </w:rPr>
-        <w:footnoteReference w:id="43"/>
+        <w:footnoteReference w:id="44"/>
       </w:r>
       <w:r>
         <w:rPr>
@@ -5057,7 +4945,7 @@
         <w:rPr>
           <w:rStyle w:val="FootnoteReference"/>
         </w:rPr>
-        <w:footnoteReference w:id="44"/>
+        <w:footnoteReference w:id="45"/>
       </w:r>
     </w:p>
     <w:p>
@@ -5078,7 +4966,7 @@
         <w:rPr>
           <w:rStyle w:val="FootnoteReference"/>
         </w:rPr>
-        <w:footnoteReference w:id="45"/>
+        <w:footnoteReference w:id="46"/>
       </w:r>
       <w:r>
         <w:rPr>
@@ -5480,7 +5368,7 @@
         <w:rPr>
           <w:rStyle w:val="FootnoteReference"/>
         </w:rPr>
-        <w:footnoteReference w:id="46"/>
+        <w:footnoteReference w:id="47"/>
       </w:r>
       <w:r>
         <w:rPr>
@@ -5493,7 +5381,7 @@
         <w:rPr>
           <w:rStyle w:val="FootnoteReference"/>
         </w:rPr>
-        <w:footnoteReference w:id="47"/>
+        <w:footnoteReference w:id="48"/>
       </w:r>
       <w:r>
         <w:rPr>
@@ -5541,7 +5429,7 @@
         <w:rPr>
           <w:rStyle w:val="FootnoteReference"/>
         </w:rPr>
-        <w:footnoteReference w:id="48"/>
+        <w:footnoteReference w:id="49"/>
       </w:r>
     </w:p>
     <w:tbl>
@@ -6228,7 +6116,7 @@
         <w:rPr>
           <w:rStyle w:val="FootnoteReference"/>
         </w:rPr>
-        <w:footnoteReference w:id="49"/>
+        <w:footnoteReference w:id="50"/>
       </w:r>
       <w:r>
         <w:rPr>
@@ -6248,7 +6136,7 @@
         <w:rPr>
           <w:rStyle w:val="FootnoteReference"/>
         </w:rPr>
-        <w:footnoteReference w:id="50"/>
+        <w:footnoteReference w:id="51"/>
       </w:r>
       <w:r>
         <w:rPr>
@@ -6318,7 +6206,7 @@
         <w:rPr>
           <w:rStyle w:val="FootnoteReference"/>
         </w:rPr>
-        <w:footnoteReference w:id="51"/>
+        <w:footnoteReference w:id="52"/>
       </w:r>
     </w:p>
     <w:tbl>
@@ -6797,7 +6685,7 @@
         <w:rPr>
           <w:rStyle w:val="FootnoteReference"/>
         </w:rPr>
-        <w:footnoteReference w:id="52"/>
+        <w:footnoteReference w:id="53"/>
       </w:r>
       <w:r>
         <w:rPr>
@@ -6860,7 +6748,7 @@
         <w:rPr>
           <w:rStyle w:val="FootnoteReference"/>
         </w:rPr>
-        <w:footnoteReference w:id="53"/>
+        <w:footnoteReference w:id="54"/>
       </w:r>
     </w:p>
     <w:tbl>
@@ -7063,7 +6951,7 @@
                 <w:rFonts w:ascii="Times New Roman" w:hAnsi="Times New Roman" w:cs="Times New Roman" w:eastAsia="Times New Roman"/>
                 <w:sz w:val="22"/>
               </w:rPr>
-              <w:t xml:space="preserve">8,87 (3,35)</w:t>
+              <w:t xml:space="preserve">9,13 (3,45)</w:t>
             </w:r>
           </w:p>
         </w:tc>
@@ -7103,7 +6991,7 @@
                 <w:rFonts w:ascii="Times New Roman" w:hAnsi="Times New Roman" w:cs="Times New Roman" w:eastAsia="Times New Roman"/>
                 <w:sz w:val="22"/>
               </w:rPr>
-              <w:t xml:space="preserve">18,24 (4,00)</w:t>
+              <w:t xml:space="preserve">18,26 (4,00)</w:t>
             </w:r>
           </w:p>
         </w:tc>
@@ -7168,7 +7056,7 @@
                 <w:rFonts w:ascii="Times New Roman" w:hAnsi="Times New Roman" w:cs="Times New Roman" w:eastAsia="Times New Roman"/>
                 <w:sz w:val="22"/>
               </w:rPr>
-              <w:t xml:space="preserve">15,32 (3,93)</w:t>
+              <w:t xml:space="preserve">17,00 (4,00)</w:t>
             </w:r>
           </w:p>
         </w:tc>
@@ -7208,7 +7096,7 @@
                 <w:rFonts w:ascii="Times New Roman" w:hAnsi="Times New Roman" w:cs="Times New Roman" w:eastAsia="Times New Roman"/>
                 <w:sz w:val="22"/>
               </w:rPr>
-              <w:t xml:space="preserve">19,96 (4,00)</w:t>
+              <w:t xml:space="preserve">18,10 (4,00)</w:t>
             </w:r>
           </w:p>
         </w:tc>
@@ -7233,7 +7121,7 @@
                 <w:rFonts w:ascii="Times New Roman" w:hAnsi="Times New Roman" w:cs="Times New Roman" w:eastAsia="Times New Roman"/>
                 <w:sz w:val="22"/>
               </w:rPr>
-              <w:t xml:space="preserve">K3. Leverage, %</w:t>
+              <w:t xml:space="preserve">K3. Kapital / aktivlar, %</w:t>
             </w:r>
           </w:p>
         </w:tc>
@@ -7253,7 +7141,7 @@
                 <w:rFonts w:ascii="Times New Roman" w:hAnsi="Times New Roman" w:cs="Times New Roman" w:eastAsia="Times New Roman"/>
                 <w:sz w:val="22"/>
               </w:rPr>
-              <w:t xml:space="preserve">12,25 (4,00)</w:t>
+              <w:t xml:space="preserve">11,6 (4,00)</w:t>
             </w:r>
           </w:p>
         </w:tc>
@@ -7273,7 +7161,7 @@
                 <w:rFonts w:ascii="Times New Roman" w:hAnsi="Times New Roman" w:cs="Times New Roman" w:eastAsia="Times New Roman"/>
                 <w:sz w:val="22"/>
               </w:rPr>
-              <w:t xml:space="preserve">11,07 (4,00)</w:t>
+              <w:t xml:space="preserve">10,6 (4,00)</w:t>
             </w:r>
           </w:p>
         </w:tc>
@@ -7293,7 +7181,7 @@
                 <w:rFonts w:ascii="Times New Roman" w:hAnsi="Times New Roman" w:cs="Times New Roman" w:eastAsia="Times New Roman"/>
                 <w:sz w:val="22"/>
               </w:rPr>
-              <w:t xml:space="preserve">16,82 (4,00)</w:t>
+              <w:t xml:space="preserve">18,7 (4,00)</w:t>
             </w:r>
           </w:p>
         </w:tc>
@@ -7313,7 +7201,7 @@
                 <w:rFonts w:ascii="Times New Roman" w:hAnsi="Times New Roman" w:cs="Times New Roman" w:eastAsia="Times New Roman"/>
                 <w:sz w:val="22"/>
               </w:rPr>
-              <w:t xml:space="preserve">18,72 (4,00)</w:t>
+              <w:t xml:space="preserve">20,2 (4,00)</w:t>
             </w:r>
           </w:p>
         </w:tc>
@@ -7358,7 +7246,7 @@
                 <w:rFonts w:ascii="Times New Roman" w:hAnsi="Times New Roman" w:cs="Times New Roman" w:eastAsia="Times New Roman"/>
                 <w:sz w:val="22"/>
               </w:rPr>
-              <w:t xml:space="preserve">2,53 (4,00)</w:t>
+              <w:t xml:space="preserve">2,5 (4,00)</w:t>
             </w:r>
           </w:p>
         </w:tc>
@@ -7378,7 +7266,7 @@
                 <w:rFonts w:ascii="Times New Roman" w:hAnsi="Times New Roman" w:cs="Times New Roman" w:eastAsia="Times New Roman"/>
                 <w:sz w:val="22"/>
               </w:rPr>
-              <w:t xml:space="preserve">7,48 (2,50)</w:t>
+              <w:t xml:space="preserve">7,5 (2,50)</w:t>
             </w:r>
           </w:p>
         </w:tc>
@@ -7398,7 +7286,7 @@
                 <w:rFonts w:ascii="Times New Roman" w:hAnsi="Times New Roman" w:cs="Times New Roman" w:eastAsia="Times New Roman"/>
                 <w:sz w:val="22"/>
               </w:rPr>
-              <w:t xml:space="preserve">4,41 (3,29)</w:t>
+              <w:t xml:space="preserve">4,4 (3,30)</w:t>
             </w:r>
           </w:p>
         </w:tc>
@@ -7418,7 +7306,7 @@
                 <w:rFonts w:ascii="Times New Roman" w:hAnsi="Times New Roman" w:cs="Times New Roman" w:eastAsia="Times New Roman"/>
                 <w:sz w:val="22"/>
               </w:rPr>
-              <w:t xml:space="preserve">12,34 (1,53)</w:t>
+              <w:t xml:space="preserve">12,3 (1,53)</w:t>
             </w:r>
           </w:p>
         </w:tc>
@@ -7463,7 +7351,7 @@
                 <w:rFonts w:ascii="Times New Roman" w:hAnsi="Times New Roman" w:cs="Times New Roman" w:eastAsia="Times New Roman"/>
                 <w:sz w:val="22"/>
               </w:rPr>
-              <w:t xml:space="preserve">18,44 (2,66)</w:t>
+              <w:t xml:space="preserve">18,4 (2,66)</w:t>
             </w:r>
           </w:p>
         </w:tc>
@@ -7483,7 +7371,7 @@
                 <w:rFonts w:ascii="Times New Roman" w:hAnsi="Times New Roman" w:cs="Times New Roman" w:eastAsia="Times New Roman"/>
                 <w:sz w:val="22"/>
               </w:rPr>
-              <w:t xml:space="preserve">35,66 (1,00)</w:t>
+              <w:t xml:space="preserve">35,7 (1,00)</w:t>
             </w:r>
           </w:p>
         </w:tc>
@@ -7503,7 +7391,7 @@
                 <w:rFonts w:ascii="Times New Roman" w:hAnsi="Times New Roman" w:cs="Times New Roman" w:eastAsia="Times New Roman"/>
                 <w:sz w:val="22"/>
               </w:rPr>
-              <w:t xml:space="preserve">9,00 (4,00)</w:t>
+              <w:t xml:space="preserve">9,0 (4,00)</w:t>
             </w:r>
           </w:p>
         </w:tc>
@@ -7523,7 +7411,7 @@
                 <w:rFonts w:ascii="Times New Roman" w:hAnsi="Times New Roman" w:cs="Times New Roman" w:eastAsia="Times New Roman"/>
                 <w:sz w:val="22"/>
               </w:rPr>
-              <w:t xml:space="preserve">25,30 (1,97)</w:t>
+              <w:t xml:space="preserve">25,3 (1,97)</w:t>
             </w:r>
           </w:p>
         </w:tc>
@@ -7588,7 +7476,7 @@
                 <w:rFonts w:ascii="Times New Roman" w:hAnsi="Times New Roman" w:cs="Times New Roman" w:eastAsia="Times New Roman"/>
                 <w:sz w:val="22"/>
               </w:rPr>
-              <w:t xml:space="preserve">7,3 (3,27)</w:t>
+              <w:t xml:space="preserve">6,5 (3,35)</w:t>
             </w:r>
           </w:p>
         </w:tc>
@@ -7628,7 +7516,7 @@
                 <w:rFonts w:ascii="Times New Roman" w:hAnsi="Times New Roman" w:cs="Times New Roman" w:eastAsia="Times New Roman"/>
                 <w:sz w:val="22"/>
               </w:rPr>
-              <w:t xml:space="preserve">26,4 (1,36)</w:t>
+              <w:t xml:space="preserve">29,1 (1,09)</w:t>
             </w:r>
           </w:p>
         </w:tc>
@@ -7653,7 +7541,7 @@
                 <w:rFonts w:ascii="Times New Roman" w:hAnsi="Times New Roman" w:cs="Times New Roman" w:eastAsia="Times New Roman"/>
                 <w:sz w:val="22"/>
               </w:rPr>
-              <w:t xml:space="preserve">L1. LCR, %</w:t>
+              <w:t xml:space="preserve">L1. Yuqori likvid aktivlar / aktivlar, %</w:t>
             </w:r>
           </w:p>
         </w:tc>
@@ -7673,7 +7561,7 @@
                 <w:rFonts w:ascii="Times New Roman" w:hAnsi="Times New Roman" w:cs="Times New Roman" w:eastAsia="Times New Roman"/>
                 <w:sz w:val="22"/>
               </w:rPr>
-              <w:t xml:space="preserve">222,9 (4,00)</w:t>
+              <w:t xml:space="preserve">18,3 (3,66)</w:t>
             </w:r>
           </w:p>
         </w:tc>
@@ -7693,7 +7581,7 @@
                 <w:rFonts w:ascii="Times New Roman" w:hAnsi="Times New Roman" w:cs="Times New Roman" w:eastAsia="Times New Roman"/>
                 <w:sz w:val="22"/>
               </w:rPr>
-              <w:t xml:space="preserve">154,0 (4,00)</w:t>
+              <w:t xml:space="preserve">18,3 (3,66)</w:t>
             </w:r>
           </w:p>
         </w:tc>
@@ -7713,7 +7601,7 @@
                 <w:rFonts w:ascii="Times New Roman" w:hAnsi="Times New Roman" w:cs="Times New Roman" w:eastAsia="Times New Roman"/>
                 <w:sz w:val="22"/>
               </w:rPr>
-              <w:t xml:space="preserve">231,9 (4,00)</w:t>
+              <w:t xml:space="preserve">15,5 (3,09)</w:t>
             </w:r>
           </w:p>
         </w:tc>
@@ -7733,7 +7621,7 @@
                 <w:rFonts w:ascii="Times New Roman" w:hAnsi="Times New Roman" w:cs="Times New Roman" w:eastAsia="Times New Roman"/>
                 <w:sz w:val="22"/>
               </w:rPr>
-              <w:t xml:space="preserve">231,9 (4,00)</w:t>
+              <w:t xml:space="preserve">15,5 (3,09)</w:t>
             </w:r>
           </w:p>
         </w:tc>
@@ -7758,7 +7646,7 @@
                 <w:rFonts w:ascii="Times New Roman" w:hAnsi="Times New Roman" w:cs="Times New Roman" w:eastAsia="Times New Roman"/>
                 <w:sz w:val="22"/>
               </w:rPr>
-              <w:t xml:space="preserve">L2. NSFR, %</w:t>
+              <w:t xml:space="preserve">L2. Kreditlar / depozitlar, %</w:t>
             </w:r>
           </w:p>
         </w:tc>
@@ -7778,7 +7666,7 @@
                 <w:rFonts w:ascii="Times New Roman" w:hAnsi="Times New Roman" w:cs="Times New Roman" w:eastAsia="Times New Roman"/>
                 <w:sz w:val="22"/>
               </w:rPr>
-              <w:t xml:space="preserve">122,2 (4,00)</w:t>
+              <w:t xml:space="preserve">206,5 (1,00)</w:t>
             </w:r>
           </w:p>
         </w:tc>
@@ -7798,7 +7686,7 @@
                 <w:rFonts w:ascii="Times New Roman" w:hAnsi="Times New Roman" w:cs="Times New Roman" w:eastAsia="Times New Roman"/>
                 <w:sz w:val="22"/>
               </w:rPr>
-              <w:t xml:space="preserve">124,8 (4,00)</w:t>
+              <w:t xml:space="preserve">221,0 (1,00)</w:t>
             </w:r>
           </w:p>
         </w:tc>
@@ -7818,7 +7706,7 @@
                 <w:rFonts w:ascii="Times New Roman" w:hAnsi="Times New Roman" w:cs="Times New Roman" w:eastAsia="Times New Roman"/>
                 <w:sz w:val="22"/>
               </w:rPr>
-              <w:t xml:space="preserve">113,0 (3,30)</w:t>
+              <w:t xml:space="preserve">208,5 (1,00)</w:t>
             </w:r>
           </w:p>
         </w:tc>
@@ -7838,7 +7726,7 @@
                 <w:rFonts w:ascii="Times New Roman" w:hAnsi="Times New Roman" w:cs="Times New Roman" w:eastAsia="Times New Roman"/>
                 <w:sz w:val="22"/>
               </w:rPr>
-              <w:t xml:space="preserve">113,0 (3,30)</w:t>
+              <w:t xml:space="preserve">324,5 (1,00)</w:t>
             </w:r>
           </w:p>
         </w:tc>
@@ -7863,7 +7751,7 @@
                 <w:rFonts w:ascii="Times New Roman" w:hAnsi="Times New Roman" w:cs="Times New Roman" w:eastAsia="Times New Roman"/>
                 <w:sz w:val="22"/>
               </w:rPr>
-              <w:t xml:space="preserve">L3. Kreditlar / depozitlar, %</w:t>
+              <w:t xml:space="preserve">D1. ROA, %</w:t>
             </w:r>
           </w:p>
         </w:tc>
@@ -7883,7 +7771,7 @@
                 <w:rFonts w:ascii="Times New Roman" w:hAnsi="Times New Roman" w:cs="Times New Roman" w:eastAsia="Times New Roman"/>
                 <w:sz w:val="22"/>
               </w:rPr>
-              <w:t xml:space="preserve">206,5 (1,00)</w:t>
+              <w:t xml:space="preserve">2,0 (3,96)</w:t>
             </w:r>
           </w:p>
         </w:tc>
@@ -7903,7 +7791,7 @@
                 <w:rFonts w:ascii="Times New Roman" w:hAnsi="Times New Roman" w:cs="Times New Roman" w:eastAsia="Times New Roman"/>
                 <w:sz w:val="22"/>
               </w:rPr>
-              <w:t xml:space="preserve">221,0 (1,00)</w:t>
+              <w:t xml:space="preserve">1,7 (3,49)</w:t>
             </w:r>
           </w:p>
         </w:tc>
@@ -7923,7 +7811,7 @@
                 <w:rFonts w:ascii="Times New Roman" w:hAnsi="Times New Roman" w:cs="Times New Roman" w:eastAsia="Times New Roman"/>
                 <w:sz w:val="22"/>
               </w:rPr>
-              <w:t xml:space="preserve">208,5 (1,00)</w:t>
+              <w:t xml:space="preserve">0,6 (1,85)</w:t>
             </w:r>
           </w:p>
         </w:tc>
@@ -7943,7 +7831,7 @@
                 <w:rFonts w:ascii="Times New Roman" w:hAnsi="Times New Roman" w:cs="Times New Roman" w:eastAsia="Times New Roman"/>
                 <w:sz w:val="22"/>
               </w:rPr>
-              <w:t xml:space="preserve">324,4 (1,00)</w:t>
+              <w:t xml:space="preserve">0,2 (1,22)</w:t>
             </w:r>
           </w:p>
         </w:tc>
@@ -7968,7 +7856,7 @@
                 <w:rFonts w:ascii="Times New Roman" w:hAnsi="Times New Roman" w:cs="Times New Roman" w:eastAsia="Times New Roman"/>
                 <w:sz w:val="22"/>
               </w:rPr>
-              <w:t xml:space="preserve">D1. ROA, %</w:t>
+              <w:t xml:space="preserve">D2. ROE, %</w:t>
             </w:r>
           </w:p>
         </w:tc>
@@ -7988,7 +7876,7 @@
                 <w:rFonts w:ascii="Times New Roman" w:hAnsi="Times New Roman" w:cs="Times New Roman" w:eastAsia="Times New Roman"/>
                 <w:sz w:val="22"/>
               </w:rPr>
-              <w:t xml:space="preserve">1,98 (3,97)</w:t>
+              <w:t xml:space="preserve">17,2 (4,00)</w:t>
             </w:r>
           </w:p>
         </w:tc>
@@ -8008,7 +7896,7 @@
                 <w:rFonts w:ascii="Times New Roman" w:hAnsi="Times New Roman" w:cs="Times New Roman" w:eastAsia="Times New Roman"/>
                 <w:sz w:val="22"/>
               </w:rPr>
-              <w:t xml:space="preserve">1,70 (3,50)</w:t>
+              <w:t xml:space="preserve">15,7 (4,00)</w:t>
             </w:r>
           </w:p>
         </w:tc>
@@ -8028,7 +7916,7 @@
                 <w:rFonts w:ascii="Times New Roman" w:hAnsi="Times New Roman" w:cs="Times New Roman" w:eastAsia="Times New Roman"/>
                 <w:sz w:val="22"/>
               </w:rPr>
-              <w:t xml:space="preserve">0,59 (1,84)</w:t>
+              <w:t xml:space="preserve">3,5 (1,69)</w:t>
             </w:r>
           </w:p>
         </w:tc>
@@ -8048,7 +7936,7 @@
                 <w:rFonts w:ascii="Times New Roman" w:hAnsi="Times New Roman" w:cs="Times New Roman" w:eastAsia="Times New Roman"/>
                 <w:sz w:val="22"/>
               </w:rPr>
-              <w:t xml:space="preserve">0,15 (1,21)</w:t>
+              <w:t xml:space="preserve">0,8 (1,16)</w:t>
             </w:r>
           </w:p>
         </w:tc>
@@ -8073,7 +7961,7 @@
                 <w:rFonts w:ascii="Times New Roman" w:hAnsi="Times New Roman" w:cs="Times New Roman" w:eastAsia="Times New Roman"/>
                 <w:sz w:val="22"/>
               </w:rPr>
-              <w:t xml:space="preserve">D2. ROE, %</w:t>
+              <w:t xml:space="preserve">D3. Xarajatlar / daromadlar, %</w:t>
             </w:r>
           </w:p>
         </w:tc>
@@ -8093,7 +7981,7 @@
                 <w:rFonts w:ascii="Times New Roman" w:hAnsi="Times New Roman" w:cs="Times New Roman" w:eastAsia="Times New Roman"/>
                 <w:sz w:val="22"/>
               </w:rPr>
-              <w:t xml:space="preserve">17,2 (4,00)</w:t>
+              <w:t xml:space="preserve">36,5 (4,00)</w:t>
             </w:r>
           </w:p>
         </w:tc>
@@ -8113,7 +8001,7 @@
                 <w:rFonts w:ascii="Times New Roman" w:hAnsi="Times New Roman" w:cs="Times New Roman" w:eastAsia="Times New Roman"/>
                 <w:sz w:val="22"/>
               </w:rPr>
-              <w:t xml:space="preserve">15,7 (4,00)</w:t>
+              <w:t xml:space="preserve">41,5 (4,00)</w:t>
             </w:r>
           </w:p>
         </w:tc>
@@ -8133,7 +8021,7 @@
                 <w:rFonts w:ascii="Times New Roman" w:hAnsi="Times New Roman" w:cs="Times New Roman" w:eastAsia="Times New Roman"/>
                 <w:sz w:val="22"/>
               </w:rPr>
-              <w:t xml:space="preserve">3,5 (1,70)</w:t>
+              <w:t xml:space="preserve">65,5 (2,72)</w:t>
             </w:r>
           </w:p>
         </w:tc>
@@ -8153,7 +8041,7 @@
                 <w:rFonts w:ascii="Times New Roman" w:hAnsi="Times New Roman" w:cs="Times New Roman" w:eastAsia="Times New Roman"/>
                 <w:sz w:val="22"/>
               </w:rPr>
-              <w:t xml:space="preserve">0,8 (1,16)</w:t>
+              <w:t xml:space="preserve">87,6 (1,62)</w:t>
             </w:r>
           </w:p>
         </w:tc>
@@ -8178,7 +8066,7 @@
                 <w:rFonts w:ascii="Times New Roman" w:hAnsi="Times New Roman" w:cs="Times New Roman" w:eastAsia="Times New Roman"/>
                 <w:sz w:val="22"/>
               </w:rPr>
-              <w:t xml:space="preserve">D3. Xarajatlar / daromadlar, %</w:t>
+              <w:t xml:space="preserve">V1. Xorijiy valyutadagi kreditlar, %</w:t>
             </w:r>
           </w:p>
         </w:tc>
@@ -8198,7 +8086,7 @@
                 <w:rFonts w:ascii="Times New Roman" w:hAnsi="Times New Roman" w:cs="Times New Roman" w:eastAsia="Times New Roman"/>
                 <w:sz w:val="22"/>
               </w:rPr>
-              <w:t xml:space="preserve">36,5 (4,00)</w:t>
+              <w:t xml:space="preserve">60,1 (1,33)</w:t>
             </w:r>
           </w:p>
         </w:tc>
@@ -8218,7 +8106,7 @@
                 <w:rFonts w:ascii="Times New Roman" w:hAnsi="Times New Roman" w:cs="Times New Roman" w:eastAsia="Times New Roman"/>
                 <w:sz w:val="22"/>
               </w:rPr>
-              <w:t xml:space="preserve">41,9 (4,00)</w:t>
+              <w:t xml:space="preserve">61,2 (1,25)</w:t>
             </w:r>
           </w:p>
         </w:tc>
@@ -8238,7 +8126,7 @@
                 <w:rFonts w:ascii="Times New Roman" w:hAnsi="Times New Roman" w:cs="Times New Roman" w:eastAsia="Times New Roman"/>
                 <w:sz w:val="22"/>
               </w:rPr>
-              <w:t xml:space="preserve">65,5 (2,73)</w:t>
+              <w:t xml:space="preserve">18,4 (4,00)</w:t>
             </w:r>
           </w:p>
         </w:tc>
@@ -8258,7 +8146,7 @@
                 <w:rFonts w:ascii="Times New Roman" w:hAnsi="Times New Roman" w:cs="Times New Roman" w:eastAsia="Times New Roman"/>
                 <w:sz w:val="22"/>
               </w:rPr>
-              <w:t xml:space="preserve">88,0 (1,60)</w:t>
+              <w:t xml:space="preserve">–</w:t>
             </w:r>
           </w:p>
         </w:tc>
@@ -8283,7 +8171,7 @@
                 <w:rFonts w:ascii="Times New Roman" w:hAnsi="Times New Roman" w:cs="Times New Roman" w:eastAsia="Times New Roman"/>
                 <w:sz w:val="22"/>
               </w:rPr>
-              <w:t xml:space="preserve">V1. Xorijiy valyutadagi kreditlar, %</w:t>
+              <w:t xml:space="preserve">V2. Xorijiy valyutadagi majburiyatlar, %</w:t>
             </w:r>
           </w:p>
         </w:tc>
@@ -8303,7 +8191,7 @@
                 <w:rFonts w:ascii="Times New Roman" w:hAnsi="Times New Roman" w:cs="Times New Roman" w:eastAsia="Times New Roman"/>
                 <w:sz w:val="22"/>
               </w:rPr>
-              <w:t xml:space="preserve">60,1 (1,33)</w:t>
+              <w:t xml:space="preserve">60,9 (1,61)</w:t>
             </w:r>
           </w:p>
         </w:tc>
@@ -8323,7 +8211,7 @@
                 <w:rFonts w:ascii="Times New Roman" w:hAnsi="Times New Roman" w:cs="Times New Roman" w:eastAsia="Times New Roman"/>
                 <w:sz w:val="22"/>
               </w:rPr>
-              <w:t xml:space="preserve">60,1 (1,33)</w:t>
+              <w:t xml:space="preserve">60,4 (1,64)</w:t>
             </w:r>
           </w:p>
         </w:tc>
@@ -8343,7 +8231,7 @@
                 <w:rFonts w:ascii="Times New Roman" w:hAnsi="Times New Roman" w:cs="Times New Roman" w:eastAsia="Times New Roman"/>
                 <w:sz w:val="22"/>
               </w:rPr>
-              <w:t xml:space="preserve">18,4 (4,00)</w:t>
+              <w:t xml:space="preserve">31,4 (3,57)</w:t>
             </w:r>
           </w:p>
         </w:tc>
@@ -8363,7 +8251,7 @@
                 <w:rFonts w:ascii="Times New Roman" w:hAnsi="Times New Roman" w:cs="Times New Roman" w:eastAsia="Times New Roman"/>
                 <w:sz w:val="22"/>
               </w:rPr>
-              <w:t xml:space="preserve">18,4 (4,00)</w:t>
+              <w:t xml:space="preserve">22,4 (4,00)</w:t>
             </w:r>
           </w:p>
         </w:tc>
@@ -8385,10 +8273,12 @@
             </w:pPr>
             <w:r>
               <w:rPr>
-                <w:rFonts w:ascii="Times New Roman" w:hAnsi="Times New Roman" w:cs="Times New Roman" w:eastAsia="Times New Roman"/>
-                <w:sz w:val="22"/>
-              </w:rPr>
-              <w:t xml:space="preserve">V2. Xorijiy valyutadagi majburiyatlar, %</w:t>
+                <w:bCs/>
+                <w:rFonts w:ascii="Times New Roman" w:hAnsi="Times New Roman" w:cs="Times New Roman" w:eastAsia="Times New Roman"/>
+                <w:b/>
+                <w:sz w:val="22"/>
+              </w:rPr>
+              <w:t xml:space="preserve">MBII</w:t>
             </w:r>
           </w:p>
         </w:tc>
@@ -8405,10 +8295,12 @@
             </w:pPr>
             <w:r>
               <w:rPr>
-                <w:rFonts w:ascii="Times New Roman" w:hAnsi="Times New Roman" w:cs="Times New Roman" w:eastAsia="Times New Roman"/>
-                <w:sz w:val="22"/>
-              </w:rPr>
-              <w:t xml:space="preserve">60,9 (1,61)</w:t>
+                <w:bCs/>
+                <w:rFonts w:ascii="Times New Roman" w:hAnsi="Times New Roman" w:cs="Times New Roman" w:eastAsia="Times New Roman"/>
+                <w:b/>
+                <w:sz w:val="22"/>
+              </w:rPr>
+              <w:t xml:space="preserve">3,27</w:t>
             </w:r>
           </w:p>
         </w:tc>
@@ -8425,10 +8317,12 @@
             </w:pPr>
             <w:r>
               <w:rPr>
-                <w:rFonts w:ascii="Times New Roman" w:hAnsi="Times New Roman" w:cs="Times New Roman" w:eastAsia="Times New Roman"/>
-                <w:sz w:val="22"/>
-              </w:rPr>
-              <w:t xml:space="preserve">60,9 (1,61)</w:t>
+                <w:bCs/>
+                <w:rFonts w:ascii="Times New Roman" w:hAnsi="Times New Roman" w:cs="Times New Roman" w:eastAsia="Times New Roman"/>
+                <w:b/>
+                <w:sz w:val="22"/>
+              </w:rPr>
+              <w:t xml:space="preserve">2,83</w:t>
             </w:r>
           </w:p>
         </w:tc>
@@ -8445,10 +8339,12 @@
             </w:pPr>
             <w:r>
               <w:rPr>
-                <w:rFonts w:ascii="Times New Roman" w:hAnsi="Times New Roman" w:cs="Times New Roman" w:eastAsia="Times New Roman"/>
-                <w:sz w:val="22"/>
-              </w:rPr>
-              <w:t xml:space="preserve">31,4 (3,57)</w:t>
+                <w:bCs/>
+                <w:rFonts w:ascii="Times New Roman" w:hAnsi="Times New Roman" w:cs="Times New Roman" w:eastAsia="Times New Roman"/>
+                <w:b/>
+                <w:sz w:val="22"/>
+              </w:rPr>
+              <w:t xml:space="preserve">3,13</w:t>
             </w:r>
           </w:p>
         </w:tc>
@@ -8465,10 +8361,12 @@
             </w:pPr>
             <w:r>
               <w:rPr>
-                <w:rFonts w:ascii="Times New Roman" w:hAnsi="Times New Roman" w:cs="Times New Roman" w:eastAsia="Times New Roman"/>
-                <w:sz w:val="22"/>
-              </w:rPr>
-              <w:t xml:space="preserve">31,4 (3,57)</w:t>
+                <w:bCs/>
+                <w:rFonts w:ascii="Times New Roman" w:hAnsi="Times New Roman" w:cs="Times New Roman" w:eastAsia="Times New Roman"/>
+                <w:b/>
+                <w:sz w:val="22"/>
+              </w:rPr>
+              <w:t xml:space="preserve">2,47</w:t>
             </w:r>
           </w:p>
         </w:tc>
@@ -8495,7 +8393,7 @@
                 <w:b/>
                 <w:sz w:val="22"/>
               </w:rPr>
-              <w:t xml:space="preserve">MBII</w:t>
+              <w:t xml:space="preserve">Sinf</w:t>
             </w:r>
           </w:p>
         </w:tc>
@@ -8517,7 +8415,7 @@
                 <w:b/>
                 <w:sz w:val="22"/>
               </w:rPr>
-              <w:t xml:space="preserve">3,40</w:t>
+              <w:t xml:space="preserve">I</w:t>
             </w:r>
           </w:p>
         </w:tc>
@@ -8539,7 +8437,7 @@
                 <w:b/>
                 <w:sz w:val="22"/>
               </w:rPr>
-              <w:t xml:space="preserve">2,94</w:t>
+              <w:t xml:space="preserve">II</w:t>
             </w:r>
           </w:p>
         </w:tc>
@@ -8561,7 +8459,7 @@
                 <w:b/>
                 <w:sz w:val="22"/>
               </w:rPr>
-              <w:t xml:space="preserve">3,27</w:t>
+              <w:t xml:space="preserve">II</w:t>
             </w:r>
           </w:p>
         </w:tc>
@@ -8583,122 +8481,7 @@
                 <w:b/>
                 <w:sz w:val="22"/>
               </w:rPr>
-              <w:t xml:space="preserve">2,62</w:t>
-            </w:r>
-          </w:p>
-        </w:tc>
-      </w:tr>
-      <w:tr>
-        <w:trPr>
-          <w:cantSplit/>
-        </w:trPr>
-        <w:tc>
-          <w:tcPr>
-            <w:tcW w:type="dxa" w:w="3175"/>
-          </w:tcPr>
-          <w:p>
-            <w:pPr>
-              <w:pStyle w:val="Compact"/>
-              <w:spacing w:line="240" w:lineRule="auto"/>
-              <w:ind w:firstLine="0"/>
-              <w:jc w:val="left"/>
-            </w:pPr>
-            <w:r>
-              <w:rPr>
-                <w:bCs/>
-                <w:rFonts w:ascii="Times New Roman" w:hAnsi="Times New Roman" w:cs="Times New Roman" w:eastAsia="Times New Roman"/>
-                <w:b/>
-                <w:sz w:val="22"/>
-              </w:rPr>
-              <w:t xml:space="preserve">Sinf</w:t>
-            </w:r>
-          </w:p>
-        </w:tc>
-        <w:tc>
-          <w:tcPr>
-            <w:tcW w:type="dxa" w:w="1531"/>
-          </w:tcPr>
-          <w:p>
-            <w:pPr>
-              <w:pStyle w:val="Compact"/>
-              <w:spacing w:line="240" w:lineRule="auto"/>
-              <w:ind w:firstLine="0"/>
-              <w:jc w:val="center"/>
-            </w:pPr>
-            <w:r>
-              <w:rPr>
-                <w:bCs/>
-                <w:rFonts w:ascii="Times New Roman" w:hAnsi="Times New Roman" w:cs="Times New Roman" w:eastAsia="Times New Roman"/>
-                <w:b/>
-                <w:sz w:val="22"/>
-              </w:rPr>
-              <w:t xml:space="preserve">I</w:t>
-            </w:r>
-          </w:p>
-        </w:tc>
-        <w:tc>
-          <w:tcPr>
-            <w:tcW w:type="dxa" w:w="1531"/>
-          </w:tcPr>
-          <w:p>
-            <w:pPr>
-              <w:pStyle w:val="Compact"/>
-              <w:spacing w:line="240" w:lineRule="auto"/>
-              <w:ind w:firstLine="0"/>
-              <w:jc w:val="center"/>
-            </w:pPr>
-            <w:r>
-              <w:rPr>
-                <w:bCs/>
-                <w:rFonts w:ascii="Times New Roman" w:hAnsi="Times New Roman" w:cs="Times New Roman" w:eastAsia="Times New Roman"/>
-                <w:b/>
-                <w:sz w:val="22"/>
-              </w:rPr>
-              <w:t xml:space="preserve">II</w:t>
-            </w:r>
-          </w:p>
-        </w:tc>
-        <w:tc>
-          <w:tcPr>
-            <w:tcW w:type="dxa" w:w="1531"/>
-          </w:tcPr>
-          <w:p>
-            <w:pPr>
-              <w:pStyle w:val="Compact"/>
-              <w:spacing w:line="240" w:lineRule="auto"/>
-              <w:ind w:firstLine="0"/>
-              <w:jc w:val="center"/>
-            </w:pPr>
-            <w:r>
-              <w:rPr>
-                <w:bCs/>
-                <w:rFonts w:ascii="Times New Roman" w:hAnsi="Times New Roman" w:cs="Times New Roman" w:eastAsia="Times New Roman"/>
-                <w:b/>
-                <w:sz w:val="22"/>
-              </w:rPr>
-              <w:t xml:space="preserve">I</w:t>
-            </w:r>
-          </w:p>
-        </w:tc>
-        <w:tc>
-          <w:tcPr>
-            <w:tcW w:type="dxa" w:w="1531"/>
-          </w:tcPr>
-          <w:p>
-            <w:pPr>
-              <w:pStyle w:val="Compact"/>
-              <w:spacing w:line="240" w:lineRule="auto"/>
-              <w:ind w:firstLine="0"/>
-              <w:jc w:val="center"/>
-            </w:pPr>
-            <w:r>
-              <w:rPr>
-                <w:bCs/>
-                <w:rFonts w:ascii="Times New Roman" w:hAnsi="Times New Roman" w:cs="Times New Roman" w:eastAsia="Times New Roman"/>
-                <w:b/>
-                <w:sz w:val="22"/>
-              </w:rPr>
-              <w:t xml:space="preserve">II</w:t>
+              <w:t xml:space="preserve">III</w:t>
             </w:r>
           </w:p>
         </w:tc>
@@ -8718,7 +8501,7 @@
           <w:i/>
           <w:sz w:val="28"/>
         </w:rPr>
-        <w:t xml:space="preserve">Izoh: qavs ichida – ball. MHXS variantida LCR banklardagi mablag‘lar yuqori likvid aktivlardan chiqarilgan holda (SQB), NSFR Bazel III metodikasi va MHXS tuzatishlari bilan hisoblandi; «Mikrokreditbank» ATB uchun likvidlik me’yorlarini qayta hisoblashga ma’lumot yetarli bo‘lmagani sababli rasmiy qiymatlar olindi; valyuta tarkibi ikki variantda bir xil qabul qilindi.</w:t>
+        <w:t xml:space="preserve">Izoh: qavs ichida – ball. MHXS variantida CET1 monandligi (MHXS bo‘yicha xususiy kapital − ozchilik ulushi − joriy yil sof foydasi) / risk bo‘yicha tortilgan aktivlar formulasi bo‘yicha, regulyativ kapital monandligi – hisobotda oshkor qilingan qiymat bo‘yicha olindi; yuqori likvid aktivlar ulushi ikki variantda bir xil (milliy balans); «Mikrokreditbank» ATB ning MHXS hisobotida xorijiy valyutadagi kreditlar ulushi oshkor qilinmagan, shu sababli valyuta bloki bitta ko‘rsatkich bo‘yicha baholandi.</w:t>
       </w:r>
     </w:p>
     <w:p>
@@ -8733,7 +8516,7 @@
           <w:rFonts w:ascii="Times New Roman" w:hAnsi="Times New Roman" w:cs="Times New Roman" w:eastAsia="Times New Roman"/>
           <w:sz w:val="28"/>
         </w:rPr>
-        <w:t xml:space="preserve">Jadval ma’lumotlari metodikaning asosiy afzalligini yaqqol ko‘rsatadi. Milliy hisobot ma’lumotlari bo‘yicha ikkala bank ham I sinfga, ya’ni barqaror banklar qatoriga kiradi: «O‘zsanoatqurilishbank» ATB ning indeksi 3,40 ni, «Mikrokreditbank» ATB niki esa 3,27 ni tashkil etadi. MHXS va Bazel III asosida esa ikkala bank ham II sinfga tushadi: indeks mos ravishda 2,94 va 2,62 ga teng. Boshqacha aytganda, ΔMBII «O‘zsanoatqurilishbank» ATB uchun −0,46 ni, «Mikrokreditbank» ATB uchun esa −0,65 ni tashkil etadi va bu farq barqarorlik sinfini o‘zgartirish uchun yetarli. Indeksning pasayishiga qaysi bloklar sabab bo‘lganini aniqlash uchun bloklar ballari solishtirildi (3.1.3-rasm).</w:t>
+        <w:t xml:space="preserve">Jadval ma’lumotlari metodikaning asosiy afzalligini yaqqol ko‘rsatadi. Milliy hisobot ma’lumotlari bo‘yicha «O‘zsanoatqurilishbank» ATB ning indeksi 3,27 ni tashkil etib, I sinfga, ya’ni barqaror banklar qatoriga kiradi, «Mikrokreditbank» ATB niki esa 3,13 ga teng bo‘lib, II sinfning yuqori chegarasiga yaqin turadi. MHXS ma’lumotlari asosida esa ikkala bank ham bir sinf pastga tushadi: «O‘zsanoatqurilishbank» ATB ning indeksi 2,83 ni, ya’ni II sinfni, «Mikrokreditbank» ATB niki esa 2,47 ni, ya’ni III sinfni tashkil etadi. Boshqacha aytganda, ΔMBII «O‘zsanoatqurilishbank» ATB uchun −0,44 ni, «Mikrokreditbank» ATB uchun esa −0,66 ni tashkil etadi va bu farq ikkala bankda ham barqarorlik sinfini o‘zgartirish uchun yetarli. Indeksning pasayishiga qaysi bloklar sabab bo‘lganini aniqlash uchun bloklar ballari solishtirildi (3.1.3-rasm).</w:t>
       </w:r>
     </w:p>
     <w:p>
@@ -8782,7 +8565,7 @@
         <w:rPr>
           <w:rStyle w:val="FootnoteReference"/>
         </w:rPr>
-        <w:footnoteReference w:id="54"/>
+        <w:footnoteReference w:id="55"/>
       </w:r>
     </w:p>
     <w:p>
@@ -8797,7 +8580,7 @@
           <w:rFonts w:ascii="Times New Roman" w:hAnsi="Times New Roman" w:cs="Times New Roman" w:eastAsia="Times New Roman"/>
           <w:sz w:val="28"/>
         </w:rPr>
-        <w:t xml:space="preserve">Rasmdan ko‘rinib turibdiki, ikkala bankda ham indeks pasayishining asosiy sababi aktivlar sifati blokidir: «O‘zsanoatqurilishbank» ATB da bu blok bali 3,55 dan 2,26 ga, «Mikrokreditbank» ATB da esa 3,42 dan 1,62 ga tushgan. Aktivlar sifati blokining vazni 0,30 bo‘lgani sababli bu o‘zgarish indeksni mos ravishda 0,39 va 0,54 ballga pasaytiradi, ya’ni ΔMBII ning 83–84 foizi aynan shu blokka to‘g‘ri keladi. Bu natija 2.3-paragrafda aniqlangan qonuniyatni indeks darajasida tasdiqlaydi: milliy va MHXS hisobotlari o‘rtasidagi tafovut eng avvalo aktivlar sifati orqali barqarorlik bahosiga ta’sir qiladi. Ikkinchi o‘rinda daromadlilik bloki turadi: «Mikrokreditbank» ATB da uning bali 2,09 dan 1,33 ga pasaygan, chunki MHXS bo‘yicha bankning 2025-yildagi sof foydasi milliy hisobotdagidan qariyb to‘rt barobar kam. Kapital bloki esa «O‘zsanoatqurilishbank» ATB da biroz pasaygan, «Mikrokreditbank» ATB da esa maksimal darajada qolgan.</w:t>
+        <w:t xml:space="preserve">Rasmdan ko‘rinib turibdiki, ikkala bankda ham indeks pasayishining asosiy sababi aktivlar sifati blokidir: «O‘zsanoatqurilishbank» ATB da bu blok bali 3,55 dan 2,28 ga, «Mikrokreditbank» ATB da esa 3,42 dan 1,53 ga tushgan. Aktivlar sifati blokining vazni 0,30 bo‘lgani sababli bu o‘zgarish indeksni mos ravishda 0,38 va 0,57 ballga pasaytiradi, ya’ni ΔMBII ning 86–87 foizi aynan shu blokka to‘g‘ri keladi. Bu natija 2.3-paragrafda aniqlangan qonuniyatni indeks darajasida tasdiqlaydi: milliy va MHXS hisobotlari o‘rtasidagi tafovut eng avvalo aktivlar sifati orqali barqarorlik bahosiga ta’sir qiladi. Ikkinchi o‘rinda daromadlilik bloki turadi: «Mikrokreditbank» ATB da uning bali 2,09 dan 1,33 ga pasaygan, chunki MHXS bo‘yicha bankning 2025-yildagi sof foydasi milliy hisobotdagidan qariyb to‘rt barobar kam. Kapital bloki esa «O‘zsanoatqurilishbank» ATB da biroz pasaygan, «Mikrokreditbank» ATB da esa maksimal darajada qolgan.</w:t>
       </w:r>
     </w:p>
     <w:p>
@@ -8812,7 +8595,7 @@
           <w:rFonts w:ascii="Times New Roman" w:hAnsi="Times New Roman" w:cs="Times New Roman" w:eastAsia="Times New Roman"/>
           <w:sz w:val="28"/>
         </w:rPr>
-        <w:t xml:space="preserve">Shu bilan birga, bloklar ballari ikki bankning risk profili tubdan farq qilishini ham ko‘rsatadi. «O‘zsanoatqurilishbank» ATB kapital, likvidlik va daromadlilik bo‘yicha yuqori ball olgan, ammo uning zaif bo‘g‘inlari – aktivlar sifati va valyuta riskiga sezgirlik: kreditlarning 60,1 foizi xorijiy valyutada berilgan. «Mikrokreditbank» ATB da esa kapital va valyuta bloklari kuchli, ammo aktivlar sifati va daromadlilik zaif. Ikkala bank uchun umumiy zaiflik – kreditlarning depozitlarga nisbati 200 foizdan yuqoriligi bo‘lib, bu ularning kreditlarni asosan tashqi qarz va davlat resurslari hisobiga moliyalashtirishini aks ettiradi. Integral indeks bunday turli profillarni yagona shkalada solishtirish imkonini beradi, bloklar ballari esa har bir bank uchun aniq nazorat yo‘nalishini ko‘rsatadi.</w:t>
+        <w:t xml:space="preserve">Shu bilan birga, bloklar ballari ikki bankning risk profili tubdan farq qilishini ham ko‘rsatadi. «O‘zsanoatqurilishbank» ATB kapital va daromadlilik bo‘yicha yuqori ball olgan, ammo uning zaif bo‘g‘inlari – aktivlar sifati va valyuta riskiga sezgirlik: kreditlarning 60,1 foizi xorijiy valyutada berilgan. «Mikrokreditbank» ATB da esa kapital va valyuta bloklari kuchli, ammo aktivlar sifati va daromadlilik zaif. Ikkala bank uchun umumiy zaiflik – kreditlarning depozitlarga nisbati 200 foizdan yuqoriligi bo‘lib, bu ularning kreditlarni asosan tashqi qarz va davlat resurslari hisobiga moliyalashtirishini aks ettiradi. Integral indeks bunday turli profillarni yagona shkalada solishtirish imkonini beradi, bloklar ballari esa har bir bank uchun aniq nazorat yo‘nalishini ko‘rsatadi.</w:t>
       </w:r>
     </w:p>
     <w:p>
@@ -8876,7 +8659,7 @@
         <w:rPr>
           <w:rStyle w:val="FootnoteReference"/>
         </w:rPr>
-        <w:footnoteReference w:id="55"/>
+        <w:footnoteReference w:id="56"/>
       </w:r>
     </w:p>
     <w:p>
@@ -8891,7 +8674,7 @@
           <w:rFonts w:ascii="Times New Roman" w:hAnsi="Times New Roman" w:cs="Times New Roman" w:eastAsia="Times New Roman"/>
           <w:sz w:val="28"/>
         </w:rPr>
-        <w:t xml:space="preserve">Rasm ma’lumotlari muhim xulosaga olib keladi. MHXS asosidagi indeks bo‘yicha banklarning tartibi uchala vaznlar tizimida ham o‘zgarmaydi: «O‘zsanoatqurilishbank» ATB har doim «Mikrokreditbank» ATB dan yuqori, taklif etilgan va teng vaznlarda ikkala bank ham II sinfda qoladi, CAMEL nisbati qo‘llanganda esa «Mikrokreditbank» ATB daromadlilik blokining vazni kattaligi sababli III sinfga tushadi. Milliy hisobot asosidagi indeksda esa teng vaznlar qo‘llanganda banklar tartibi o‘zgaradi: «Mikrokreditbank» ATB ning indeksi 3,21 ni, «O‘zsanoatqurilishbank» ATB niki 3,19 ni tashkil etadi. Demak, MHXS asosidagi indeks vaznlar tanloviga kamroq sezgir, ya’ni barqarorroq natija beradi. Buning sababi shundaki, milliy ma’lumotlarda aktivlar sifati muammolari yashiringani uchun bloklar ballari bir-biriga yaqin bo‘lib qoladi va natija vaznlarga ko‘proq bog‘liq bo‘ladi, MHXS ma’lumotlarida esa bloklar o‘rtasidagi haqiqiy farqlar aniq namoyon bo‘ladi.</w:t>
+        <w:t xml:space="preserve">Rasm ma’lumotlari muhim xulosaga olib keladi. MHXS asosidagi indeks bo‘yicha banklarning tartibi uchala vaznlar tizimida ham o‘zgarmaydi: «O‘zsanoatqurilishbank» ATB har doim «Mikrokreditbank» ATB dan yuqori, «Mikrokreditbank» ATB esa taklif etilgan va CAMEL vaznlarida III sinfda, teng vaznlarda II sinfning quyi chegarasida (2,58) bo‘ladi. Milliy hisobot asosidagi indeksda esa teng vaznlar qo‘llanganda banklar tartibi o‘zgaradi: «Mikrokreditbank» ATB ning indeksi 3,07 ni, «O‘zsanoatqurilishbank» ATB niki 3,06 ni tashkil etadi. Demak, MHXS asosidagi indeks vaznlar tanloviga kamroq sezgir, ya’ni barqarorroq natija beradi. Buning sababi shundaki, milliy ma’lumotlarda aktivlar sifati muammolari yashiringani uchun bloklar ballari bir-biriga yaqin bo‘lib qoladi va natija vaznlarga ko‘proq bog‘liq bo‘ladi, MHXS ma’lumotlarida esa bloklar o‘rtasidagi haqiqiy farqlar aniq namoyon bo‘ladi.</w:t>
       </w:r>
     </w:p>
     <w:p>
@@ -8947,7 +8730,7 @@
         <w:rPr>
           <w:rStyle w:val="FootnoteReference"/>
         </w:rPr>
-        <w:footnoteReference w:id="56"/>
+        <w:footnoteReference w:id="57"/>
       </w:r>
     </w:p>
     <w:tbl>
@@ -9943,7 +9726,7 @@
           <w:rFonts w:ascii="Times New Roman" w:hAnsi="Times New Roman" w:cs="Times New Roman" w:eastAsia="Times New Roman"/>
           <w:sz w:val="28"/>
         </w:rPr>
-        <w:t xml:space="preserve">Jadvaldan ko‘rinib turibdiki, taklif etilayotgan metodika mavjud yondashuvlarning afzalliklarini birlashtiradi: CAMELS va Rossiya Banki metodikasidan blokli tuzilma va baholashni nazorat choralari bilan bog‘lash, Xalqaro valyuta jamg‘armasi ko‘rsatkichlaridan ochiqlik va xalqaro taqqoslanuvchanlik, Bazel III dan esa chegaraviy qiymatlar olingan. Shu bilan birga, uning uchta o‘ziga xos jihati mavjud: aktivlar sifatini MHXS 9 bosqichlari asosida baholash, milliy va MHXS hisobotlari o‘rtasidagi tafovutni ΔMBII orqali o‘lchash va ko‘rsatkichlarni uzluksiz shkalada ballash. Metodikaning cheklovlarini ham qayd etish lozim: chegaraviy qiymatlar va vaznlar qisman ekspert yo‘li bilan belgilangan, boshqaruv sifati bloki ochiq ma’lumotlar asosida baholanmaydi, likvidlik me’yorlarini Bazel III metodikasi bo‘yicha to‘liq qayta hisoblash esa banklarning batafsil hisobot shakllarini talab qiladi. Bu cheklovlar indeksning bashorat kuchini tekshirish orqali dissertatsiyaning to‘rtinchi bobida qisman bartaraf etiladi.</w:t>
+        <w:t xml:space="preserve">Jadvaldan ko‘rinib turibdiki, taklif etilayotgan metodika mavjud yondashuvlarning afzalliklarini birlashtiradi: CAMELS va Rossiya Banki metodikasidan blokli tuzilma va baholashni nazorat choralari bilan bog‘lash, Xalqaro valyuta jamg‘armasi ko‘rsatkichlaridan ochiqlik va xalqaro taqqoslanuvchanlik, Bazel III dan esa chegaraviy qiymatlar olingan. Shu bilan birga, uning uchta o‘ziga xos jihati mavjud: aktivlar sifatini MHXS 9 bosqichlari asosida baholash, milliy va MHXS hisobotlari o‘rtasidagi tafovutni ΔMBII orqali o‘lchash va ko‘rsatkichlarni uzluksiz shkalada ballash. Metodikaning cheklovlarini ham qayd etish lozim: chegaraviy qiymatlar va vaznlar qisman ekspert yo‘li bilan belgilangan, boshqaruv sifati bloki ochiq ma’lumotlar asosida baholanmaydi, likvidlik bloki esa ochiq ma’lumotlarda mavjud bo‘lmagan LCR va NSFR o‘rniga ularga yaqin ko‘rsatkichlar bilan baholanadi. Bu cheklovlar indeksning bashorat kuchini tekshirish orqali dissertatsiyaning to‘rtinchi bobida qisman bartaraf etiladi.</w:t>
       </w:r>
     </w:p>
     <w:p>
@@ -9958,10 +9741,10 @@
           <w:rFonts w:ascii="Times New Roman" w:hAnsi="Times New Roman" w:cs="Times New Roman" w:eastAsia="Times New Roman"/>
           <w:sz w:val="28"/>
         </w:rPr>
-        <w:t xml:space="preserve">Moliyaviy barqarorlikni integral indeks asosida baholashning takomillashtirilgan metodikasini ishlab chiqish natijasida xulosa qilish mumkinki, taklif etilayotgan moliyaviy barqarorlikning integral indeksi kapital yetarliligi, aktivlar sifati, likvidlik, daromadlilik va valyuta riskiga sezgirlik bloklari bo‘yicha Bazel III, MHXS 9 va Xalqaro valyuta jamg‘armasi standartlariga bog‘langan 14 ta ko‘rsatkichni yagona bahoga keltiradi. Ko‘rsatkichlarning chegaraviy qiymatlari «me’yoriy talab – ball chegarasi» tamoyili asosida belgilanib, ular uzluksiz shkalada ballanadi, bloklar esa 0,25; 0,30; 0,20; 0,15 va 0,10 vaznlar bilan birlashtiriladi. Metodikani ikki bankka qo‘llash milliy hisobot asosida I sinfga kiradigan ikkala bank ham MHXS va Bazel III asosida II sinfga tushishini, ΔMBII ning 80 foizdan ortig‘i esa aktivlar sifati blokiga to‘g‘ri kelishini ko‘rsatdi. Sezgirlik tahlili esa MHXS asosidagi indeks vaznlar tanloviga kamroq bog‘liq ekanini tasdiqladi. Bu o‘z navbatida, metodikani bank tizimidagi barcha banklarga qo‘llash va ularni moliyaviy barqarorlik darajasi bo‘yicha reyting baholash imkonini beradi, bu esa keyingi paragrafda amalga oshiriladi.</w:t>
+        <w:t xml:space="preserve">Moliyaviy barqarorlikni integral indeks asosida baholashning takomillashtirilgan metodikasini ishlab chiqish natijasida xulosa qilish mumkinki, taklif etilayotgan moliyaviy barqarorlikning integral indeksi kapital yetarliligi, aktivlar sifati, likvidlik, daromadlilik va valyuta riskiga sezgirlik bloklari bo‘yicha Bazel III, MHXS 9 va Xalqaro valyuta jamg‘armasi standartlariga bog‘langan va banklarning ochiq hisobotlaridan hisoblanadigan 13 ta ko‘rsatkichni yagona bahoga keltiradi. Ko‘rsatkichlarning chegaraviy qiymatlari «me’yoriy talab – ball chegarasi» tamoyili asosida belgilanib, ular uzluksiz shkalada ballanadi, bloklar esa 0,25; 0,30; 0,20; 0,15 va 0,10 vaznlar bilan birlashtiriladi. Metodikani ikki bankka qo‘llash MHXS ma’lumotlari asosida ikkala bank ham milliy hisobotdagiga nisbatan bir sinf pastga tushishini, ΔMBII ning 85 foizdan ortig‘i esa aktivlar sifati blokiga to‘g‘ri kelishini ko‘rsatdi. Sezgirlik tahlili esa MHXS asosidagi indeks vaznlar tanloviga kamroq bog‘liq ekanini tasdiqladi. Bu o‘z navbatida, metodikani bank tizimidagi barcha banklarga qo‘llash va ularni moliyaviy barqarorlik darajasi bo‘yicha reyting baholash imkonini beradi, bu esa keyingi paragrafda amalga oshiriladi.</w:t>
       </w:r>
     </w:p>
-    <w:bookmarkEnd w:id="57"/>
+    <w:bookmarkEnd w:id="58"/>
     <w:sectPr>
       <w:pgMar w:left="1701" w:right="850" w:top="1134" w:bottom="1134"/>
     </w:sectPr>
@@ -10384,7 +10167,7 @@
         <w:t xml:space="preserve"> </w:t>
       </w:r>
       <w:r>
-        <w:t xml:space="preserve">Устойчивость банковской системы и развитие банковской политики: монография / под ред. О.И. Лаврушина. – М.: КНОРУС, 2014. – С. 52–53.</w:t>
+        <w:t xml:space="preserve">O‘zbekiston Respublikasi Markaziy banki Boshqaruvining 2015-yil 22-iyuldagi 19/14-son qarori bilan tasdiqlangan «Tijorat banklarining likvidliligini boshqarishga qo‘yiladigan talablar to‘g‘risida»gi nizom (ro‘yxat raqami 2709) // O‘zbekiston Respublikasi qonun hujjatlari to‘plami. – 2015. – 32 (688)-son. – 437-modda.</w:t>
       </w:r>
     </w:p>
   </w:footnote>
@@ -10403,7 +10186,7 @@
         <w:t xml:space="preserve"> </w:t>
       </w:r>
       <w:r>
-        <w:t xml:space="preserve">Оценка финансовой устойчивости кредитной организации: учебник / под ред. О.И. Лаврушина, И.Д. Мамоновой. – М.: КНОРУС, 2011. – С. 145–147.</w:t>
+        <w:t xml:space="preserve">Устойчивость банковской системы и развитие банковской политики: монография / под ред. О.И. Лаврушина. – М.: КНОРУС, 2014. – С. 52–53.</w:t>
       </w:r>
     </w:p>
   </w:footnote>
@@ -10441,7 +10224,7 @@
         <w:t xml:space="preserve"> </w:t>
       </w:r>
       <w:r>
-        <w:t xml:space="preserve">Izzi L., Oricchio G., Vitale L. Basel III Credit Rating Systems: An Applied Guide to Quantitative and Qualitative Models. – Basingstoke: Palgrave Macmillan, 2012. – P. 85.</w:t>
+        <w:t xml:space="preserve">Оценка финансовой устойчивости кредитной организации: учебник / под ред. О.И. Лаврушина, И.Д. Мамоновой. – М.: КНОРУС, 2011. – С. 145–147.</w:t>
       </w:r>
     </w:p>
   </w:footnote>
@@ -10460,7 +10243,7 @@
         <w:t xml:space="preserve"> </w:t>
       </w:r>
       <w:r>
-        <w:t xml:space="preserve">Tadqiqot natijasida muallif tomonidan 3.1.2-jadval asosida ishlab chiqildi.</w:t>
+        <w:t xml:space="preserve">Izzi L., Oricchio G., Vitale L. Basel III Credit Rating Systems: An Applied Guide to Quantitative and Qualitative Models. – Basingstoke: Palgrave Macmillan, 2012. – P. 85.</w:t>
       </w:r>
     </w:p>
   </w:footnote>
@@ -10479,7 +10262,7 @@
         <w:t xml:space="preserve"> </w:t>
       </w:r>
       <w:r>
-        <w:t xml:space="preserve">Карминский А.М. Кредитные рейтинги и их моделирование. – М.: Изд. дом НИУ ВШЭ, 2015. – С. 89–91.</w:t>
+        <w:t xml:space="preserve">Tadqiqot natijasida muallif tomonidan 3.1.2-jadval asosida ishlab chiqildi.</w:t>
       </w:r>
     </w:p>
   </w:footnote>
@@ -10498,7 +10281,7 @@
         <w:t xml:space="preserve"> </w:t>
       </w:r>
       <w:r>
-        <w:t xml:space="preserve">Оценка финансовой устойчивости кредитной организации: учебник / под ред. О.И. Лаврушина, И.Д. Мамоновой. – М.: КНОРУС, 2011. – С. 68.</w:t>
+        <w:t xml:space="preserve">Карминский А.М. Кредитные рейтинги и их моделирование. – М.: Изд. дом НИУ ВШЭ, 2015. – С. 89–91.</w:t>
       </w:r>
     </w:p>
   </w:footnote>
@@ -10517,7 +10300,7 @@
         <w:t xml:space="preserve"> </w:t>
       </w:r>
       <w:r>
-        <w:t xml:space="preserve">Устойчивость банковской системы и развитие банковской политики: монография / под ред. О.И. Лаврушина. – М.: КНОРУС, 2014. – С. 51.</w:t>
+        <w:t xml:space="preserve">Оценка финансовой устойчивости кредитной организации: учебник / под ред. О.И. Лаврушина, И.Д. Мамоновой. – М.: КНОРУС, 2011. – С. 68.</w:t>
       </w:r>
     </w:p>
   </w:footnote>
@@ -10536,7 +10319,7 @@
         <w:t xml:space="preserve"> </w:t>
       </w:r>
       <w:r>
-        <w:t xml:space="preserve">Tadqiqot natijasida muallif tomonidan quyidagi manbalar asosida ishlab chiqildi: Karaliyev T.M., Sayfiddinov I.F. Tijorat banklari faoliyatini tartibga solish va nazorati: darslik. – T.: Iqtisod-Moliya, 2019. – B. 213; Оценка финансовой устойчивости кредитной организации: учебник / под ред. О.И. Лаврушина, И.Д. Мамоновой. – М.: КНОРУС, 2011. – С. 68; Izzi L., Oricchio G., Vitale L. Basel III Credit Rating Systems: An Applied Guide to Quantitative and Qualitative Models. – Basingstoke: Palgrave Macmillan, 2012. – P. 76, 85.</w:t>
+        <w:t xml:space="preserve">Устойчивость банковской системы и развитие банковской политики: монография / под ред. О.И. Лаврушина. – М.: КНОРУС, 2014. – С. 51.</w:t>
       </w:r>
     </w:p>
   </w:footnote>
@@ -10555,7 +10338,7 @@
         <w:t xml:space="preserve"> </w:t>
       </w:r>
       <w:r>
-        <w:t xml:space="preserve">Karaliyev T.M., Sayfiddinov I.F. Tijorat banklari faoliyatini tartibga solish va nazorati: darslik. – T.: Iqtisod-Moliya, 2019. – B. 213.</w:t>
+        <w:t xml:space="preserve">Tadqiqot natijasida muallif tomonidan quyidagi manbalar asosida ishlab chiqildi: Karaliyev T.M., Sayfiddinov I.F. Tijorat banklari faoliyatini tartibga solish va nazorati: darslik. – T.: Iqtisod-Moliya, 2019. – B. 213; Оценка финансовой устойчивости кредитной организации: учебник / под ред. О.И. Лаврушина, И.Д. Мамоновой. – М.: КНОРУС, 2011. – С. 68; Izzi L., Oricchio G., Vitale L. Basel III Credit Rating Systems: An Applied Guide to Quantitative and Qualitative Models. – Basingstoke: Palgrave Macmillan, 2012. – P. 76, 85.</w:t>
       </w:r>
     </w:p>
   </w:footnote>
@@ -10574,7 +10357,7 @@
         <w:t xml:space="preserve"> </w:t>
       </w:r>
       <w:r>
-        <w:t xml:space="preserve">Izzi L., Oricchio G., Vitale L. Basel III Credit Rating Systems: An Applied Guide to Quantitative and Qualitative Models. – Basingstoke: Palgrave Macmillan, 2012. – P. 76.</w:t>
+        <w:t xml:space="preserve">Karaliyev T.M., Sayfiddinov I.F. Tijorat banklari faoliyatini tartibga solish va nazorati: darslik. – T.: Iqtisod-Moliya, 2019. – B. 213.</w:t>
       </w:r>
     </w:p>
   </w:footnote>
@@ -10593,7 +10376,7 @@
         <w:t xml:space="preserve"> </w:t>
       </w:r>
       <w:r>
-        <w:t xml:space="preserve">Tadqiqot natijasida muallif tomonidan quyidagi manbalar asosida ishlab chiqildi: Cargill T.F. The Financial System, Financial Regulation and Central Bank Policy. – Cambridge: Cambridge University Press, 2017. – P. 193; Оценка финансовой устойчивости кредитной организации: учебник / под ред. О.И. Лаврушина, И.Д. Мамоновой. – М.: КНОРУС, 2011. – С. 91–92.</w:t>
+        <w:t xml:space="preserve">Izzi L., Oricchio G., Vitale L. Basel III Credit Rating Systems: An Applied Guide to Quantitative and Qualitative Models. – Basingstoke: Palgrave Macmillan, 2012. – P. 76.</w:t>
       </w:r>
     </w:p>
   </w:footnote>
@@ -10612,7 +10395,7 @@
         <w:t xml:space="preserve"> </w:t>
       </w:r>
       <w:r>
-        <w:t xml:space="preserve">Cargill T.F. The Financial System, Financial Regulation and Central Bank Policy. – Cambridge: Cambridge University Press, 2017. – P. 193.</w:t>
+        <w:t xml:space="preserve">Tadqiqot natijasida muallif tomonidan quyidagi manbalar asosida ishlab chiqildi: Cargill T.F. The Financial System, Financial Regulation and Central Bank Policy. – Cambridge: Cambridge University Press, 2017. – P. 193; Оценка финансовой устойчивости кредитной организации: учебник / под ред. О.И. Лаврушина, И.Д. Мамоновой. – М.: КНОРУС, 2011. – С. 91–92.</w:t>
       </w:r>
     </w:p>
   </w:footnote>
@@ -10631,7 +10414,7 @@
         <w:t xml:space="preserve"> </w:t>
       </w:r>
       <w:r>
-        <w:t xml:space="preserve">Tadqiqot natijasida muallif tomonidan quyidagi manbalar ma’lumotlari asosida hisoblandi: «O‘zsanoatqurilishbank» ATB ning Markaziy bankka taqdim etilgan prudensial hisobot shakllari (crs003C, crs003L, crs003O): bank balansi, daromadlar, regulyativ kapital hisob-kitobi, aktivlarni tasniflash va prudensial me’yorlar jadvallari, 2020–2025-yillar 30-dekabr holatiga; «Mikrokreditbank» ATB ning Markaziy bankka taqdim etilgan prudensial hisobot shakllari (crs005C, crs005L, crs005O): bank balansi, daromadlar, regulyativ kapital hisob-kitobi, aktivlarni tasniflash va prudensial me’yorlar jadvallari, 2020–2025-yillar 30-dekabr holatiga; Joint Stock Commercial Bank «Uzbek Industrial and Construction Bank» and its subsidiaries. Consolidated Financial Statements for the year ended 31 December 2025 and Independent Auditor’s Report. – Tashkent, 2026. – P. 2–3, 28–31, 37–38, 74; Акционерно-коммерческий банк «Микрокредитбанк». Консолидированная финансовая отчетность за год, закончившийся 31 декабря 2025 года, и заключение независимых аудиторов. – Ташкент, 2026. – С. 11–12, 48.</w:t>
+        <w:t xml:space="preserve">Cargill T.F. The Financial System, Financial Regulation and Central Bank Policy. – Cambridge: Cambridge University Press, 2017. – P. 193.</w:t>
       </w:r>
     </w:p>
   </w:footnote>
@@ -10650,7 +10433,7 @@
         <w:t xml:space="preserve"> </w:t>
       </w:r>
       <w:r>
-        <w:t xml:space="preserve">Tadqiqot natijasida muallif tomonidan 3.1.5-jadval ma’lumotlari asosida ishlab chiqildi.</w:t>
+        <w:t xml:space="preserve">Tadqiqot natijasida muallif tomonidan quyidagi manbalar ma’lumotlari asosida hisoblandi: «O‘zsanoatqurilishbank» ATB ning Markaziy bankka taqdim etilgan prudensial hisobot shakllari (crs003C, crs003L, crs003O): bank balansi, daromadlar, regulyativ kapital hisob-kitobi, aktivlarni tasniflash va prudensial me’yorlar jadvallari, 2020–2025-yillar 30-dekabr holatiga; «Mikrokreditbank» ATB ning Markaziy bankka taqdim etilgan prudensial hisobot shakllari (crs005C, crs005L, crs005O): bank balansi, daromadlar, regulyativ kapital hisob-kitobi, aktivlarni tasniflash va prudensial me’yorlar jadvallari, 2020–2025-yillar 30-dekabr holatiga; Joint Stock Commercial Bank «Uzbek Industrial and Construction Bank» and its subsidiaries. Consolidated Financial Statements for the year ended 31 December 2025 and Independent Auditor’s Report. – Tashkent, 2026. – P. 2–3, 28–31, 37–38, 74; Акционерно-коммерческий банк «Микрокредитбанк». Консолидированная финансовая отчетность за год, закончившийся 31 декабря 2025 года, и заключение независимых аудиторов. – Ташкент, 2026. – С. 11–12, 48.</w:t>
       </w:r>
     </w:p>
   </w:footnote>
@@ -10669,11 +10452,30 @@
         <w:t xml:space="preserve"> </w:t>
       </w:r>
       <w:r>
-        <w:t xml:space="preserve">Tadqiqot natijasida muallif tomonidan 3.1.3 va 3.1.5-jadvallar ma’lumotlari asosida hisoblandi.</w:t>
+        <w:t xml:space="preserve">Tadqiqot natijasida muallif tomonidan 3.1.5-jadval ma’lumotlari asosida ishlab chiqildi.</w:t>
       </w:r>
     </w:p>
   </w:footnote>
   <w:footnote w:id="56">
+    <w:p>
+      <w:pPr>
+        <w:pStyle w:val="FootnoteText"/>
+      </w:pPr>
+      <w:r>
+        <w:rPr>
+          <w:rStyle w:val="FootnoteReference"/>
+        </w:rPr>
+        <w:footnoteRef/>
+      </w:r>
+      <w:r>
+        <w:t xml:space="preserve"> </w:t>
+      </w:r>
+      <w:r>
+        <w:t xml:space="preserve">Tadqiqot natijasida muallif tomonidan 3.1.3 va 3.1.5-jadvallar ma’lumotlari asosida hisoblandi.</w:t>
+      </w:r>
+    </w:p>
+  </w:footnote>
+  <w:footnote w:id="57">
     <w:p>
       <w:pPr>
         <w:pStyle w:val="FootnoteText"/>
@@ -12087,7 +11889,7 @@
                   <c:v>3.55</c:v>
                 </c:pt>
                 <c:pt idx="2">
-                  <c:v>3.0</c:v>
+                  <c:v>2.33</c:v>
                 </c:pt>
                 <c:pt idx="3">
                   <c:v>3.99</c:v>
@@ -12186,19 +11988,19 @@
                 <c:formatCode>General</c:formatCode>
                 <c:ptCount val="5"/>
                 <c:pt idx="0">
-                  <c:v>3.76</c:v>
+                  <c:v>3.82</c:v>
                 </c:pt>
                 <c:pt idx="1">
-                  <c:v>2.26</c:v>
+                  <c:v>2.28</c:v>
                 </c:pt>
                 <c:pt idx="2">
-                  <c:v>3.0</c:v>
+                  <c:v>2.33</c:v>
                 </c:pt>
                 <c:pt idx="3">
                   <c:v>3.83</c:v>
                 </c:pt>
                 <c:pt idx="4">
-                  <c:v>1.47</c:v>
+                  <c:v>1.45</c:v>
                 </c:pt>
               </c:numCache>
             </c:numRef>
@@ -12297,7 +12099,7 @@
                   <c:v>3.42</c:v>
                 </c:pt>
                 <c:pt idx="2">
-                  <c:v>2.77</c:v>
+                  <c:v>2.05</c:v>
                 </c:pt>
                 <c:pt idx="3">
                   <c:v>2.09</c:v>
@@ -12399,16 +12201,16 @@
                   <c:v>4.0</c:v>
                 </c:pt>
                 <c:pt idx="1">
-                  <c:v>1.62</c:v>
+                  <c:v>1.53</c:v>
                 </c:pt>
                 <c:pt idx="2">
-                  <c:v>2.77</c:v>
+                  <c:v>2.05</c:v>
                 </c:pt>
                 <c:pt idx="3">
                   <c:v>1.33</c:v>
                 </c:pt>
                 <c:pt idx="4">
-                  <c:v>3.79</c:v>
+                  <c:v>4.0</c:v>
                 </c:pt>
               </c:numCache>
             </c:numRef>
@@ -12696,16 +12498,16 @@
                 <c:formatCode>General</c:formatCode>
                 <c:ptCount val="4"/>
                 <c:pt idx="0">
-                  <c:v>3.4</c:v>
+                  <c:v>3.27</c:v>
                 </c:pt>
                 <c:pt idx="1">
-                  <c:v>2.94</c:v>
+                  <c:v>2.83</c:v>
                 </c:pt>
                 <c:pt idx="2">
-                  <c:v>3.27</c:v>
+                  <c:v>3.13</c:v>
                 </c:pt>
                 <c:pt idx="3">
-                  <c:v>2.62</c:v>
+                  <c:v>2.47</c:v>
                 </c:pt>
               </c:numCache>
             </c:numRef>
@@ -12795,16 +12597,16 @@
                 <c:formatCode>General</c:formatCode>
                 <c:ptCount val="4"/>
                 <c:pt idx="0">
-                  <c:v>3.19</c:v>
+                  <c:v>3.06</c:v>
                 </c:pt>
                 <c:pt idx="1">
-                  <c:v>2.86</c:v>
+                  <c:v>2.74</c:v>
                 </c:pt>
                 <c:pt idx="2">
-                  <c:v>3.21</c:v>
+                  <c:v>3.07</c:v>
                 </c:pt>
                 <c:pt idx="3">
-                  <c:v>2.7</c:v>
+                  <c:v>2.58</c:v>
                 </c:pt>
               </c:numCache>
             </c:numRef>
@@ -12894,16 +12696,16 @@
                 <c:formatCode>General</c:formatCode>
                 <c:ptCount val="4"/>
                 <c:pt idx="0">
-                  <c:v>3.67</c:v>
+                  <c:v>3.57</c:v>
                 </c:pt>
                 <c:pt idx="1">
-                  <c:v>3.11</c:v>
+                  <c:v>3.03</c:v>
                 </c:pt>
                 <c:pt idx="2">
-                  <c:v>3.12</c:v>
+                  <c:v>3.02</c:v>
                 </c:pt>
                 <c:pt idx="3">
-                  <c:v>2.27</c:v>
+                  <c:v>2.13</c:v>
                 </c:pt>
               </c:numCache>
             </c:numRef>

</xml_diff>